<commit_message>
docs: mask the student IDs and build the lecturer's copy separately
The repository will be cloned into a public one, so the committed files
show only the last 2 digits of each student ID (******22): README,
PLAN, the report member list, the cover page of the UIT template and
the generated report and user guide (docx + PDF).

The copy handed in to the lecturer is built with --submission
(build_report.py, build_user_guide.py): it reads the real IDs from
docs/report/student_ids.local.json and writes *_submission.docx. Both
files are ignored by git so the real IDs are never committed again.
</commit_message>
<xml_diff>
--- a/docs/report/template/uit_report_template.docx
+++ b/docs/report/template/uit_report_template.docx
@@ -423,7 +423,7 @@
               <w:jc w:val="center"/>
             </w:pPr>
             <w:r>
-              <w:t>25540042</w:t>
+              <w:t>******42</w:t>
             </w:r>
           </w:p>
         </w:tc>
@@ -508,7 +508,7 @@
               <w:jc w:val="center"/>
             </w:pPr>
             <w:r>
-              <w:t>25540022</w:t>
+              <w:t>******22</w:t>
             </w:r>
           </w:p>
         </w:tc>
@@ -593,7 +593,7 @@
               <w:jc w:val="center"/>
             </w:pPr>
             <w:r>
-              <w:t>25540025</w:t>
+              <w:t>******25</w:t>
             </w:r>
           </w:p>
         </w:tc>
@@ -678,7 +678,7 @@
               <w:jc w:val="center"/>
             </w:pPr>
             <w:r>
-              <w:t>25540008</w:t>
+              <w:t>******08</w:t>
             </w:r>
           </w:p>
         </w:tc>
@@ -763,7 +763,7 @@
               <w:jc w:val="center"/>
             </w:pPr>
             <w:r>
-              <w:t>25540009</w:t>
+              <w:t>******09</w:t>
             </w:r>
           </w:p>
         </w:tc>

</xml_diff>